<commit_message>
feat: update resume with portfolio link and embed interactive viewer with download option
</commit_message>
<xml_diff>
--- a/Shishir_Bhavsar_Resume_Final (1).docx
+++ b/Shishir_Bhavsar_Resume_Final (1).docx
@@ -46,8 +46,8 @@
         <w:rPr>
           <w:rFonts w:ascii="Calibri" w:cs="Calibri" w:eastAsia="Calibri" w:hAnsi="Calibri"/>
           <w:color w:val="2D2D2D"/>
-          <w:sz w:val="19"/>
-          <w:szCs w:val="19"/>
+          <w:sz w:val="18"/>
+          <w:szCs w:val="18"/>
         </w:rPr>
         <w:t xml:space="preserve">+91 7400301950</w:t>
       </w:r>
@@ -55,18 +55,18 @@
         <w:rPr>
           <w:rFonts w:ascii="Calibri" w:cs="Calibri" w:eastAsia="Calibri" w:hAnsi="Calibri"/>
           <w:color w:val="BFCBD6"/>
-          <w:sz w:val="19"/>
-          <w:szCs w:val="19"/>
-        </w:rPr>
-        <w:t xml:space="preserve">   ·   </w:t>
+          <w:sz w:val="18"/>
+          <w:szCs w:val="18"/>
+        </w:rPr>
+        <w:t xml:space="preserve">  ·  </w:t>
       </w:r>
       <w:hyperlink w:history="1" r:id="rIdcexyxqwfrh1nycadmzkbh">
         <w:r>
           <w:rPr>
             <w:rFonts w:ascii="Calibri" w:cs="Calibri" w:eastAsia="Calibri" w:hAnsi="Calibri"/>
             <w:color w:val="1155CC"/>
-            <w:sz w:val="19"/>
-            <w:szCs w:val="19"/>
+            <w:sz w:val="18"/>
+            <w:szCs w:val="18"/>
             <w:u w:val="single" w:color="1155CC"/>
           </w:rPr>
           <w:t xml:space="preserve">shishirbhavsar4@gmail.com</w:t>
@@ -76,36 +76,36 @@
         <w:rPr>
           <w:rFonts w:ascii="Calibri" w:cs="Calibri" w:eastAsia="Calibri" w:hAnsi="Calibri"/>
           <w:color w:val="BFCBD6"/>
-          <w:sz w:val="19"/>
-          <w:szCs w:val="19"/>
-        </w:rPr>
-        <w:t xml:space="preserve">   ·   </w:t>
+          <w:sz w:val="18"/>
+          <w:szCs w:val="18"/>
+        </w:rPr>
+        <w:t xml:space="preserve">  ·  </w:t>
       </w:r>
       <w:r>
         <w:rPr>
           <w:rFonts w:ascii="Calibri" w:cs="Calibri" w:eastAsia="Calibri" w:hAnsi="Calibri"/>
           <w:color w:val="2D2D2D"/>
-          <w:sz w:val="19"/>
-          <w:szCs w:val="19"/>
-        </w:rPr>
-        <w:t xml:space="preserve">Malad (W), Mumbai – 400064</w:t>
+          <w:sz w:val="18"/>
+          <w:szCs w:val="18"/>
+        </w:rPr>
+        <w:t xml:space="preserve">Malad (W), Mumbai</w:t>
       </w:r>
       <w:r>
         <w:rPr>
           <w:rFonts w:ascii="Calibri" w:cs="Calibri" w:eastAsia="Calibri" w:hAnsi="Calibri"/>
           <w:color w:val="BFCBD6"/>
-          <w:sz w:val="19"/>
-          <w:szCs w:val="19"/>
-        </w:rPr>
-        <w:t xml:space="preserve">   ·   </w:t>
+          <w:sz w:val="18"/>
+          <w:szCs w:val="18"/>
+        </w:rPr>
+        <w:t xml:space="preserve">  ·  </w:t>
       </w:r>
       <w:hyperlink w:history="1" r:id="rIdgithubmain">
         <w:r>
           <w:rPr>
             <w:rFonts w:ascii="Calibri" w:cs="Calibri" w:eastAsia="Calibri" w:hAnsi="Calibri"/>
             <w:color w:val="1155CC"/>
-            <w:sz w:val="19"/>
-            <w:szCs w:val="19"/>
+            <w:sz w:val="18"/>
+            <w:szCs w:val="18"/>
             <w:u w:val="single" w:color="1155CC"/>
           </w:rPr>
           <w:t>github.com/svdgamerz</w:t>
@@ -115,18 +115,39 @@
         <w:rPr>
           <w:rFonts w:ascii="Calibri" w:cs="Calibri" w:eastAsia="Calibri" w:hAnsi="Calibri"/>
           <w:color w:val="BFCBD6"/>
-          <w:sz w:val="19"/>
-          <w:szCs w:val="19"/>
-        </w:rPr>
-        <w:t xml:space="preserve">   ·   </w:t>
+          <w:sz w:val="18"/>
+          <w:szCs w:val="18"/>
+        </w:rPr>
+        <w:t xml:space="preserve">  ·  </w:t>
+      </w:r>
+      <w:hyperlink w:history="1" r:id="rId12">
+        <w:r>
+          <w:rPr>
+            <w:rFonts w:ascii="Calibri" w:cs="Calibri" w:eastAsia="Calibri" w:hAnsi="Calibri"/>
+            <w:color w:val="1155CC"/>
+            <w:sz w:val="18"/>
+            <w:szCs w:val="18"/>
+            <w:u w:val="single" w:color="1155CC"/>
+          </w:rPr>
+          <w:t>Portfolio</w:t>
+        </w:r>
+      </w:hyperlink>
+      <w:r>
+        <w:rPr>
+          <w:rFonts w:ascii="Calibri" w:cs="Calibri" w:eastAsia="Calibri" w:hAnsi="Calibri"/>
+          <w:color w:val="BFCBD6"/>
+          <w:sz w:val="18"/>
+          <w:szCs w:val="18"/>
+        </w:rPr>
+        <w:t xml:space="preserve">  ·  </w:t>
       </w:r>
       <w:hyperlink w:history="1" r:id="rIdlinkedin">
         <w:r>
           <w:rPr>
             <w:rFonts w:ascii="Calibri" w:cs="Calibri" w:eastAsia="Calibri" w:hAnsi="Calibri"/>
             <w:color w:val="1155CC"/>
-            <w:sz w:val="19"/>
-            <w:szCs w:val="19"/>
+            <w:sz w:val="18"/>
+            <w:szCs w:val="18"/>
             <w:u w:val="single" w:color="1155CC"/>
           </w:rPr>
           <w:t>LinkedIn</w:t>

</xml_diff>